<commit_message>
Adding John's project files
</commit_message>
<xml_diff>
--- a/resources/Reset Promox Password.docx
+++ b/resources/Reset Promox Password.docx
@@ -42,17 +42,14 @@
     </w:p>
     <w:p>
       <w:pPr>
-        <w:pStyle w:val="ListParagraph"/>
-        <w:numPr>
-          <w:ilvl w:val="0"/>
-          <w:numId w:val="1"/>
-        </w:numPr>
-        <w:rPr>
-          <w:lang w:val="en-US"/>
-        </w:rPr>
-      </w:pPr>
-      <w:r>
-        <w:rPr>
+        <w:ind w:left="360"/>
+        <w:rPr>
+          <w:lang w:val="en-US"/>
+        </w:rPr>
+      </w:pPr>
+      <w:r>
+        <w:rPr>
+          <w:noProof/>
           <w:lang w:val="en-US"/>
         </w:rPr>
         <w:drawing>
@@ -94,6 +91,27 @@
     </w:p>
     <w:p>
       <w:pPr>
+        <w:rPr>
+          <w:lang w:val="en-US"/>
+        </w:rPr>
+      </w:pPr>
+      <w:r>
+        <w:rPr>
+          <w:lang w:val="en-US"/>
+        </w:rPr>
+        <w:br w:type="page"/>
+      </w:r>
+    </w:p>
+    <w:p>
+      <w:pPr>
+        <w:pStyle w:val="ListParagraph"/>
+        <w:rPr>
+          <w:lang w:val="en-US"/>
+        </w:rPr>
+      </w:pPr>
+    </w:p>
+    <w:p>
+      <w:pPr>
         <w:pStyle w:val="ListParagraph"/>
         <w:numPr>
           <w:ilvl w:val="0"/>
@@ -140,20 +158,16 @@
     </w:p>
     <w:p>
       <w:pPr>
-        <w:pStyle w:val="ListParagraph"/>
-        <w:numPr>
-          <w:ilvl w:val="0"/>
-          <w:numId w:val="1"/>
-        </w:numPr>
-        <w:rPr>
-          <w:lang w:val="en-US"/>
-        </w:rPr>
-      </w:pPr>
-      <w:r>
-        <w:rPr>
-          <w:lang w:val="en-US"/>
-        </w:rPr>
-        <w:lastRenderedPageBreak/>
+        <w:ind w:left="360"/>
+        <w:rPr>
+          <w:lang w:val="en-US"/>
+        </w:rPr>
+      </w:pPr>
+      <w:r>
+        <w:rPr>
+          <w:noProof/>
+          <w:lang w:val="en-US"/>
+        </w:rPr>
         <w:drawing>
           <wp:inline distT="0" distB="0" distL="0" distR="0" wp14:anchorId="10959824" wp14:editId="7E6E646F">
             <wp:extent cx="5731510" cy="3709035"/>
@@ -211,19 +225,17 @@
     </w:p>
     <w:p>
       <w:pPr>
-        <w:pStyle w:val="ListParagraph"/>
-        <w:numPr>
-          <w:ilvl w:val="0"/>
-          <w:numId w:val="1"/>
-        </w:numPr>
-        <w:rPr>
-          <w:lang w:val="en-US"/>
-        </w:rPr>
-      </w:pPr>
-      <w:r>
-        <w:rPr>
-          <w:lang w:val="en-US"/>
-        </w:rPr>
+        <w:ind w:left="360"/>
+        <w:rPr>
+          <w:lang w:val="en-US"/>
+        </w:rPr>
+      </w:pPr>
+      <w:r>
+        <w:rPr>
+          <w:noProof/>
+          <w:lang w:val="en-US"/>
+        </w:rPr>
+        <w:lastRenderedPageBreak/>
         <w:drawing>
           <wp:inline distT="0" distB="0" distL="0" distR="0" wp14:anchorId="486B67FA" wp14:editId="743790B8">
             <wp:extent cx="5731510" cy="3911600"/>
@@ -306,14 +318,7 @@
         <w:rPr>
           <w:lang w:val="en-US"/>
         </w:rPr>
-        <w:t xml:space="preserve"> the screen will bug out and show the below. Just arrow down until you see “Root – Drop to root shell prompt” and </w:t>
-      </w:r>
-      <w:r>
-        <w:rPr>
-          <w:lang w:val="en-US"/>
-        </w:rPr>
-        <w:lastRenderedPageBreak/>
-        <w:t>press enter</w:t>
+        <w:t xml:space="preserve"> the screen will bug out and show the below. Just arrow down until you see “Root – Drop to root shell prompt” and press enter</w:t>
       </w:r>
       <w:r>
         <w:rPr>
@@ -323,6 +328,7 @@
       </w:r>
       <w:r>
         <w:rPr>
+          <w:noProof/>
           <w:lang w:val="en-US"/>
         </w:rPr>
         <w:drawing>
@@ -364,6 +370,27 @@
     </w:p>
     <w:p>
       <w:pPr>
+        <w:rPr>
+          <w:lang w:val="en-US"/>
+        </w:rPr>
+      </w:pPr>
+      <w:r>
+        <w:rPr>
+          <w:lang w:val="en-US"/>
+        </w:rPr>
+        <w:br w:type="page"/>
+      </w:r>
+    </w:p>
+    <w:p>
+      <w:pPr>
+        <w:ind w:left="360"/>
+        <w:rPr>
+          <w:lang w:val="en-US"/>
+        </w:rPr>
+      </w:pPr>
+    </w:p>
+    <w:p>
+      <w:pPr>
         <w:pStyle w:val="ListParagraph"/>
         <w:numPr>
           <w:ilvl w:val="0"/>
@@ -377,19 +404,7 @@
         <w:rPr>
           <w:lang w:val="en-US"/>
         </w:rPr>
-        <w:t>You’ll be asked to enter “</w:t>
-      </w:r>
-      <w:r>
-        <w:rPr>
-          <w:lang w:val="en-US"/>
-        </w:rPr>
-        <w:t>maintenance</w:t>
-      </w:r>
-      <w:r>
-        <w:rPr>
-          <w:lang w:val="en-US"/>
-        </w:rPr>
-        <w:t xml:space="preserve"> mode”. Hit enter to contain, you’ll then be greeted with a shell (may look slightly different):</w:t>
+        <w:t>You’ll be asked to enter “maintenance mode”. Hit enter to contain, you’ll then be greeted with a shell (may look slightly different):</w:t>
       </w:r>
       <w:r>
         <w:rPr>
@@ -399,6 +414,7 @@
       </w:r>
       <w:r>
         <w:rPr>
+          <w:noProof/>
           <w:lang w:val="en-US"/>
         </w:rPr>
         <w:drawing>
@@ -558,20 +574,16 @@
     </w:p>
     <w:p>
       <w:pPr>
-        <w:pStyle w:val="ListParagraph"/>
-        <w:numPr>
-          <w:ilvl w:val="0"/>
-          <w:numId w:val="1"/>
-        </w:numPr>
-        <w:rPr>
-          <w:lang w:val="en-US"/>
-        </w:rPr>
-      </w:pPr>
-      <w:r>
-        <w:rPr>
-          <w:lang w:val="en-US"/>
-        </w:rPr>
-        <w:lastRenderedPageBreak/>
+        <w:ind w:left="360"/>
+        <w:rPr>
+          <w:lang w:val="en-US"/>
+        </w:rPr>
+      </w:pPr>
+      <w:r>
+        <w:rPr>
+          <w:noProof/>
+          <w:lang w:val="en-US"/>
+        </w:rPr>
         <w:drawing>
           <wp:inline distT="0" distB="0" distL="0" distR="0" wp14:anchorId="1A62301E" wp14:editId="76997948">
             <wp:extent cx="5731510" cy="4168775"/>

</xml_diff>